<commit_message>
SCRUM-86 Implemented parser + GeoJSON
</commit_message>
<xml_diff>
--- a/Documentation/PREVAJANJE/languageAnalysisAndPlanning/Projektna-PrevajanjeProgramskihJezikov.docx
+++ b/Documentation/PREVAJANJE/languageAnalysisAndPlanning/Projektna-PrevajanjeProgramskihJezikov.docx
@@ -1043,6 +1043,9 @@
             <w:r>
               <w:t xml:space="preserve"> »Nova hiša«</w:t>
             </w:r>
+            <w:r>
+              <w:t>;</w:t>
+            </w:r>
           </w:p>
         </w:tc>
         <w:tc>
@@ -1084,6 +1087,9 @@
             <w:proofErr w:type="spellEnd"/>
             <w:r>
               <w:t xml:space="preserve"> »nepremicnine.si«</w:t>
+            </w:r>
+            <w:r>
+              <w:t>;</w:t>
             </w:r>
           </w:p>
         </w:tc>
@@ -1225,13 +1231,8 @@
             <w:tcW w:w="5619" w:type="dxa"/>
           </w:tcPr>
           <w:p>
-            <w:proofErr w:type="spellStart"/>
             <w:r>
-              <w:t>pravokostnik</w:t>
-            </w:r>
-            <w:proofErr w:type="spellEnd"/>
-            <w:r>
-              <w:t xml:space="preserve"> (zgoraj-levo, spodaj-desno)</w:t>
+              <w:t>pravokotnik (zgoraj-levo, spodaj-desno)</w:t>
             </w:r>
           </w:p>
         </w:tc>
@@ -3378,7 +3379,6 @@
         </w:rPr>
         <w:t xml:space="preserve">    </w:t>
       </w:r>
-      <w:proofErr w:type="gramStart"/>
       <w:r>
         <w:rPr>
           <w:rFonts w:ascii="Consolas" w:eastAsia="Times New Roman" w:hAnsi="Consolas" w:cs="Times New Roman"/>
@@ -3403,7 +3403,6 @@
         </w:rPr>
         <w:t>(</w:t>
       </w:r>
-      <w:proofErr w:type="gramEnd"/>
       <w:r>
         <w:rPr>
           <w:rFonts w:ascii="Consolas" w:eastAsia="Times New Roman" w:hAnsi="Consolas" w:cs="Times New Roman"/>
@@ -5408,7 +5407,6 @@
         </w:rPr>
         <w:t xml:space="preserve">    </w:t>
       </w:r>
-      <w:proofErr w:type="gramStart"/>
       <w:r>
         <w:rPr>
           <w:rFonts w:ascii="Consolas" w:eastAsia="Times New Roman" w:hAnsi="Consolas" w:cs="Times New Roman"/>
@@ -5433,7 +5431,6 @@
         </w:rPr>
         <w:t>(</w:t>
       </w:r>
-      <w:proofErr w:type="gramEnd"/>
       <w:r>
         <w:rPr>
           <w:rFonts w:ascii="Consolas" w:eastAsia="Times New Roman" w:hAnsi="Consolas" w:cs="Times New Roman"/>
@@ -7103,6 +7100,7 @@
   <w:style w:type="character" w:default="1" w:styleId="DefaultParagraphFont">
     <w:name w:val="Default Paragraph Font"/>
     <w:uiPriority w:val="1"/>
+    <w:semiHidden/>
     <w:unhideWhenUsed/>
   </w:style>
   <w:style w:type="table" w:default="1" w:styleId="TableNormal">

</xml_diff>